<commit_message>
Add non-state actor analysis and r=49 equivalence derivation
New Section 9.1: Asymmetry in non-international armed conflict
- Derives r* = 49 where transparent map delay equals blind sweep delay
- Shows state at r=49 concedes nothing militarily vs undisclosed adversary
- Demonstrates zero-residual property requires only defender compliance
- Discusses bidirectional information asymmetry for r < 49

New Section 9.2: Non-state actors and collective response
- Proposes Collective Response Mechanism (CRM) with three principles:
  automatic assistance, state responsibility for proxies, differentiated
  legitimacy
- Cites Geneva Call precedent (60+ NSAGs signed Deeds of Commitment)
- Establishes responsible/irresponsible use distinction

Word count: 8724 (within JoBS 8000-10000 target)

Co-Authored-By: Tatsuki Onishi <bougtoir@gmail.com>
</commit_message>
<xml_diff>
--- a/landmine_transparent_map/output/manuscript_JoBS.docx
+++ b/landmine_transparent_map/output/manuscript_JoBS.docx
@@ -3400,6 +3400,182 @@
       </w:r>
     </w:p>
     <w:p>
+      <w:pPr>
+        <w:pStyle w:val="Heading2"/>
+      </w:pPr>
+      <w:r>
+        <w:t>9.1 Asymmetry in non-international armed conflict</w:t>
+      </w:r>
+    </w:p>
+    <w:p>
+      <w:r>
+        <w:t>A critical question arises in non-international armed conflicts: if only the state actor publishes a transparent map while the non-state adversary operates at r = ∞ (no disclosure), does this create an exploitable asymmetry? The concern is that the government’s maps reveal information about defensive dispositions while rebel forces retain full uncertainty.</w:t>
+      </w:r>
+    </w:p>
+    <w:p>
+      <w:r>
+        <w:t>The model provides a precise answer. Setting delay_map(r) equal to delay_blind and solving for the equivalence point:</w:t>
+      </w:r>
+    </w:p>
+    <w:p>
+      <w:r>
+        <w:t>N × (1 + r) × t</w:t>
+      </w:r>
+      <w:r>
+        <w:rPr>
+          <w:vertAlign w:val="subscript"/>
+        </w:rPr>
+        <w:t>clear</w:t>
+      </w:r>
+      <w:r>
+        <w:t xml:space="preserve"> / W = D × t</w:t>
+      </w:r>
+      <w:r>
+        <w:rPr>
+          <w:vertAlign w:val="subscript"/>
+        </w:rPr>
+        <w:t>probe</w:t>
+      </w:r>
+      <w:r>
+        <w:t xml:space="preserve"> / δ²</w:t>
+      </w:r>
+    </w:p>
+    <w:p>
+      <w:r>
+        <w:t>Solving for r:</w:t>
+      </w:r>
+    </w:p>
+    <w:p>
+      <w:r>
+        <w:t>r* = (W × D × t</w:t>
+      </w:r>
+      <w:r>
+        <w:rPr>
+          <w:vertAlign w:val="subscript"/>
+        </w:rPr>
+        <w:t>probe</w:t>
+      </w:r>
+      <w:r>
+        <w:t>) / (N × t</w:t>
+      </w:r>
+      <w:r>
+        <w:rPr>
+          <w:vertAlign w:val="subscript"/>
+        </w:rPr>
+        <w:t>clear</w:t>
+      </w:r>
+      <w:r>
+        <w:t xml:space="preserve"> × δ²) − 1</w:t>
+      </w:r>
+    </w:p>
+    <w:p>
+      <w:r>
+        <w:t xml:space="preserve">Substituting baseline parameters: r* = (5000 × 300 × 5) / (200 × 30 × 25) − 1 = 50 − 1 = 49. At r = 49, the transparent map regime imposes </w:t>
+      </w:r>
+      <w:r>
+        <w:rPr>
+          <w:b/>
+        </w:rPr>
+        <w:t>exactly the same delay</w:t>
+      </w:r>
+      <w:r>
+        <w:t xml:space="preserve"> on the attacker as a completely undisclosed minefield. The attacker gains no advantage from the published map because at this ratio, clearing all marked positions takes precisely as long as blind sweeping the entire breach lane. However, the post-conflict outcomes are starkly different: the map regime guarantees zero residual mines, whereas the undisclosed minefield leaves an expected 10 residual mines after clearance (at p_detect = 0.95).</w:t>
+      </w:r>
+    </w:p>
+    <w:p>
+      <w:r>
+        <w:t xml:space="preserve">This yields a crucial insight for non-international armed conflicts: a state operating at r = 49 concedes </w:t>
+      </w:r>
+      <w:r>
+        <w:rPr>
+          <w:i/>
+        </w:rPr>
+        <w:t>nothing</w:t>
+      </w:r>
+      <w:r>
+        <w:t xml:space="preserve"> in military terms relative to a non-state adversary using undisclosed mines, while securing complete post-conflict safety for its own population. For lower values of r preferred on policy grounds (r = 5–20), the military asymmetry exists but is partially offset by two factors. First, state forces possess complementary capabilities—surveillance, artillery, air power—that amplify minefield effectiveness through force multiplication (Section 4.3). Second, state forces typically have intelligence capabilities (aerial reconnaissance, signals intelligence, informant networks) that partially reveal non-state actor mine locations, reducing the effective adversary r below infinity. The information asymmetry is therefore bidirectional, not unilateral.</w:t>
+      </w:r>
+    </w:p>
+    <w:p>
+      <w:r>
+        <w:t xml:space="preserve">Moreover, the zero-residual property depends </w:t>
+      </w:r>
+      <w:r>
+        <w:rPr>
+          <w:i/>
+        </w:rPr>
+        <w:t>only on the defender’s own compliance</w:t>
+      </w:r>
+      <w:r>
+        <w:t xml:space="preserve">, not the adversary’s. Even if a non-state actor uses undisclosed mines, the state’s own published map ensures that all </w:t>
+      </w:r>
+      <w:r>
+        <w:rPr>
+          <w:i/>
+        </w:rPr>
+        <w:t>state-emplaced</w:t>
+      </w:r>
+      <w:r>
+        <w:t xml:space="preserve"> mines are fully cleared after conflict. This unilateral benefit requires no reciprocity—a significant advantage over treaty mechanisms that depend on mutual compliance.</w:t>
+      </w:r>
+    </w:p>
+    <w:p>
+      <w:pPr>
+        <w:pStyle w:val="Heading2"/>
+      </w:pPr>
+      <w:r>
+        <w:t>9.2 Non-state actors and collective response</w:t>
+      </w:r>
+    </w:p>
+    <w:p>
+      <w:r>
+        <w:t>The proposed framework applies exclusively to state actors operating within the law of armed conflict. Non-state armed groups (NSAGs) and terrorist organisations remain outside the scope of treaty-based regulation—a limitation shared with all existing instruments including the Ottawa Convention and CCW Amended Protocol II. However, this shared limitation does not preclude complementary mechanisms specifically addressing non-state mine use.</w:t>
+      </w:r>
+    </w:p>
+    <w:p>
+      <w:r>
+        <w:t>We propose a Collective Response Mechanism (CRM) as an institutional complement to the transparent map framework. The CRM would operate on three principles:</w:t>
+      </w:r>
+    </w:p>
+    <w:p>
+      <w:r>
+        <w:rPr>
+          <w:b/>
+        </w:rPr>
+        <w:t xml:space="preserve">First, automatic assistance: </w:t>
+      </w:r>
+      <w:r>
+        <w:t>when NSAG mine use is confirmed in a signatory state’s territory, treaty parties assume a collective obligation to provide humanitarian mine clearance funding and technical assistance. This socialises the clearance burden created by actors beyond treaty control and provides immediate benefit to affected civilian populations.</w:t>
+      </w:r>
+    </w:p>
+    <w:p>
+      <w:r>
+        <w:rPr>
+          <w:b/>
+        </w:rPr>
+        <w:t xml:space="preserve">Second, state responsibility for proxies: </w:t>
+      </w:r>
+      <w:r>
+        <w:t>states that supply mines to non-state actors or provide material support for NSAG mining operations incur liability under the framework. NSAG mine use serves as an automatic trigger for sanctions review against identified state sponsors. This creates upstream incentives to restrict mine transfers to non-state actors, complementing existing arms embargo mechanisms under UN Security Council resolutions.</w:t>
+      </w:r>
+    </w:p>
+    <w:p>
+      <w:r>
+        <w:rPr>
+          <w:b/>
+        </w:rPr>
+        <w:t xml:space="preserve">Third, differentiated legitimacy: </w:t>
+      </w:r>
+      <w:r>
+        <w:t>the framework establishes a clear legal and normative distinction between “responsible use” (states publishing transparent maps within the regulated r parameter) and “irresponsible use” (any mine deployment without position disclosure). This binary classification strengthens the normative case against NSAG mine use by providing a concrete, verifiable standard of responsible behaviour that NSAGs manifestly fail to meet. It also provides legal clarity for states re-introducing mines: compliance with the transparent map protocol demonstrates good faith commitment to humanitarian norms, insulating compliant states from the stigma associated with indiscriminate mine use.</w:t>
+      </w:r>
+    </w:p>
+    <w:p>
+      <w:r>
+        <w:t>Precedent for such mechanisms exists. The Geneva Call initiative has secured “Deeds of Commitment” from over 60 non-state armed groups pledging mine non-use—demonstrating that normative pressure can reach beyond treaty law. The transparent map framework strengthens this norm by making the distinction between responsible and irresponsible use operationally concrete and externally verifiable.</w:t>
+      </w:r>
+    </w:p>
+    <w:p>
       <w:r>
         <w:t>Finally, the political feasibility of gaining acceptance for any framework that legitimises mine use—however constrained—should not be underestimated. The Ottawa Convention’s norm-setting achievement has created strong institutional resistance to any proposal perceived as weakening the prohibition. We argue that the transparent map framework should be positioned not as a weakening but as a strengthening of post-conflict humanitarian outcomes: it provides a safety guarantee (zero residual) that even full Ottawa compliance cannot offer for states that withdraw and use mines without constraints.</w:t>
       </w:r>

</xml_diff>

<commit_message>
Emphasise unilateral benefit and dominant strategy property in conclusion
Add two paragraphs to Section 10 (Conclusion):
1. Unilateral benefit: r=49 yields zero military sacrifice vs non-signatory,
   while guaranteeing zero residual for own territory. Post-conflict
   reconstruction, refugee return, agricultural resumption enabled immediately.
2. Treaty adoption dynamics: inverts prisoner's dilemma — ratification is
   a dominant strategy (benefits the ratifier regardless of adversary behaviour).
   Eliminates principal barrier to multilateral adoption.

Word count: 8951 (within JoBS 8000-10000 target)

Co-Authored-By: Tatsuki Onishi <bougtoir@gmail.com>
</commit_message>
<xml_diff>
--- a/landmine_transparent_map/output/manuscript_JoBS.docx
+++ b/landmine_transparent_map/output/manuscript_JoBS.docx
@@ -3633,6 +3633,43 @@
     </w:p>
     <w:p>
       <w:r>
+        <w:t xml:space="preserve">A fourth property deserves particular emphasis: </w:t>
+      </w:r>
+      <w:r>
+        <w:rPr>
+          <w:b/>
+        </w:rPr>
+        <w:t xml:space="preserve">unilateral benefit without reciprocity. </w:t>
+      </w:r>
+      <w:r>
+        <w:t xml:space="preserve">As demonstrated in Section 9.1, a state operating at r = 49 achieves exactly the same breach delay as a completely undisclosed minefield. This means that even in conflict with a non-signatory adversary—whether a state that has not ratified the framework or a non-state armed group—the defending state sacrifices </w:t>
+      </w:r>
+      <w:r>
+        <w:rPr>
+          <w:i/>
+        </w:rPr>
+        <w:t>nothing</w:t>
+      </w:r>
+      <w:r>
+        <w:t xml:space="preserve"> in military terms by publishing its map. Yet the post-conflict dividend is transformative: upon cessation of hostilities, every position on the published map is systematically cleared, yielding a deterministic guarantee of zero residual mines in the state’s own defensive zones. Reconstruction, refugee return, and agricultural resumption can commence immediately in cleared areas without the years-long uncertainty characteristic of unmapped minefields.</w:t>
+      </w:r>
+    </w:p>
+    <w:p>
+      <w:r>
+        <w:t xml:space="preserve">This unilateral benefit structure has profound implications for treaty adoption dynamics. Classical arms control faces a prisoner’s dilemma: each state benefits from others’ compliance but is tempted to defect. The transparent map framework inverts this logic. A state benefits from its </w:t>
+      </w:r>
+      <w:r>
+        <w:rPr>
+          <w:i/>
+        </w:rPr>
+        <w:t>own</w:t>
+      </w:r>
+      <w:r>
+        <w:t xml:space="preserve"> compliance regardless of others’ behaviour—the zero-residual property depends solely on the defender’s map accuracy, not the adversary’s participation. Ratification is therefore a dominant strategy: it improves post-conflict outcomes for the ratifying state under all scenarios (adversary ratifies, adversary does not ratify, adversary is a non-state actor). This eliminates the principal barrier to multilateral adoption and makes unilateral or small-coalition implementation viable as a first step.</w:t>
+      </w:r>
+    </w:p>
+    <w:p>
+      <w:r>
         <w:t>For the Baltic states and Finland, this framework provides an operationally credible middle path at a critical juncture. Rather than returning to unrestricted mine use (accepting humanitarian costs) or remaining within a prohibition that sacrifices military utility (accepting security costs), these states could adopt the transparent map regime as a NATO-wide standard. In doing so, they would demonstrate that responsible deterrence and humanitarian norms are not merely compatible but complementary—that publishing a minefield map is simultaneously an act of military preparation and an act of humanitarian commitment.</w:t>
       </w:r>
     </w:p>

</xml_diff>

<commit_message>
Add Section 9.3: Border changes and map continuity
Analyses four territorial change scenarios:
- Defence succeeds: standard clearance
- Territory lost: occupier uses pre-published map (no record transfer needed)
- Territory recaptured: enemy maps available if adversary also compliant
- Negotiated adjustment: published data enables immediate resettlement

Key insight: pre-publication eliminates CCW Art.9 record-transfer problem.
Registry architecture ensures data persists through state collapse.
Refugee return enabled by deterministic clearance endpoint.

Word count: 9351 (within JoBS 8000-10000 target)

Co-Authored-By: Tatsuki Onishi <bougtoir@gmail.com>
</commit_message>
<xml_diff>
--- a/landmine_transparent_map/output/manuscript_JoBS.docx
+++ b/landmine_transparent_map/output/manuscript_JoBS.docx
@@ -3576,6 +3576,87 @@
       </w:r>
     </w:p>
     <w:p>
+      <w:pPr>
+        <w:pStyle w:val="Heading2"/>
+      </w:pPr>
+      <w:r>
+        <w:t>9.3 Border changes and map continuity</w:t>
+      </w:r>
+    </w:p>
+    <w:p>
+      <w:r>
+        <w:t>Conflicts that alter territorial boundaries raise a distinct challenge: minefields emplaced as border defences may end up in territory controlled by the former adversary. Under CCW Amended Protocol II Article 9, parties are obligated to transfer minefield records to the opposing party and to the UN Secretary-General upon cessation of hostilities. However, this obligation relies on post-conflict cooperation—precisely the condition least likely to obtain after territorial conquest.</w:t>
+      </w:r>
+    </w:p>
+    <w:p>
+      <w:r>
+        <w:t xml:space="preserve">The transparent map framework resolves this problem by design. Because maps are </w:t>
+      </w:r>
+      <w:r>
+        <w:rPr>
+          <w:i/>
+        </w:rPr>
+        <w:t>published before or during conflict</w:t>
+      </w:r>
+      <w:r>
+        <w:t>, the information is already in the public domain regardless of subsequent territorial changes. Four scenarios illustrate this:</w:t>
+      </w:r>
+    </w:p>
+    <w:p>
+      <w:r>
+        <w:rPr>
+          <w:b/>
+        </w:rPr>
+        <w:t xml:space="preserve">Defence succeeds (borders maintained): </w:t>
+      </w:r>
+      <w:r>
+        <w:t>Standard case. The defending state clears its own published positions using the map. Zero residual guaranteed.</w:t>
+      </w:r>
+    </w:p>
+    <w:p>
+      <w:r>
+        <w:rPr>
+          <w:b/>
+        </w:rPr>
+        <w:t xml:space="preserve">Territory lost (occupation): </w:t>
+      </w:r>
+      <w:r>
+        <w:t>The occupying power has full access to the published map and can clear all marked positions in the occupied territory. Unlike the CCW regime, no bilateral negotiation for record transfer is needed. The map’s pre-publication eliminates dependence on defeated state cooperation.</w:t>
+      </w:r>
+    </w:p>
+    <w:p>
+      <w:r>
+        <w:rPr>
+          <w:b/>
+        </w:rPr>
+        <w:t xml:space="preserve">Territory recaptured: </w:t>
+      </w:r>
+      <w:r>
+        <w:t>If the adversary also operated under the transparent map regime, their published positions enable systematic clearance of enemy-emplaced mines in recaptured territory. If the adversary did not publish (non-signatory or non-state actor), the recapturing state faces the same blind-sweep problem as under the status quo—but its own mines remain fully mapped and clearable.</w:t>
+      </w:r>
+    </w:p>
+    <w:p>
+      <w:r>
+        <w:rPr>
+          <w:b/>
+        </w:rPr>
+        <w:t xml:space="preserve">Negotiated border adjustment: </w:t>
+      </w:r>
+      <w:r>
+        <w:t>In cases of agreed territorial exchange (e.g., post-conflict peace treaty adjusting borders), the published map provides complete information to the receiving state without requiring additional diplomatic arrangements. This facilitates rapid civilian resettlement in transferred territories.</w:t>
+      </w:r>
+    </w:p>
+    <w:p>
+      <w:r>
+        <w:t>The permanence of published information is further strengthened by the proposed registry architecture (Section 7.3). An append-only international registry—whether maintained by the UN, a dedicated treaty organisation, or implemented as a distributed ledger—ensures that map data persists independently of the emplacing state’s continued existence or cooperation. Even in scenarios of state collapse (as occurred in Yugoslavia or the Soviet Union), the registry preserves mine location data for successor states, international organisations, or humanitarian clearance agencies.</w:t>
+      </w:r>
+    </w:p>
+    <w:p>
+      <w:r>
+        <w:t>This property is particularly relevant for refugee return. Displaced populations can consult the published map to identify safe corridors and cleared zones, enabling phased return aligned with clearance operations. The deterministic endpoint—once all published positions are cleared, the area is certifiably safe—provides a level of assurance that probabilistic clearance methods cannot match, accelerating the political and practical conditions for post-conflict reconstruction.</w:t>
+      </w:r>
+    </w:p>
+    <w:p>
       <w:r>
         <w:t>Finally, the political feasibility of gaining acceptance for any framework that legitimises mine use—however constrained—should not be underestimated. The Ottawa Convention’s norm-setting achievement has created strong institutional resistance to any proposal perceived as weakening the prohibition. We argue that the transparent map framework should be positioned not as a weakening but as a strengthening of post-conflict humanitarian outcomes: it provides a safety guarantee (zero residual) that even full Ottawa compliance cannot offer for states that withdraw and use mines without constraints.</w:t>
       </w:r>

</xml_diff>

<commit_message>
Introduce MINE (Mapping Is Not Exposure) protocol naming
- Update title to 'The MINE Framework (Mapping Is Not Exposure)'
- Introduce acronym in abstract and introduction
- Rename registry to 'MINE Registry' in Section 7.3
- Rename verification protocol to 'MINE verification protocol'
- Update figure captions to reference 'MINE regime'
- Replace ~40 instances of 'transparent map framework/regime' with
  'MINE framework/regime' throughout
- Add 'MINE framework' to keywords
- Retain 'transparent map' as descriptive noun where appropriate

Word count: 9,046 (within JoBS 8,000-10,000 target)

Co-Authored-By: Tatsuki Onishi <bougtoir@gmail.com>
</commit_message>
<xml_diff>
--- a/landmine_transparent_map/output/manuscript_JoBS.docx
+++ b/landmine_transparent_map/output/manuscript_JoBS.docx
@@ -11,7 +11,7 @@
           <w:b/>
           <w:sz w:val="32"/>
         </w:rPr>
-        <w:t>Transparent Minefield Mapping with Dummy Positions: A Game-Theoretic Framework for Reconciling Military Utility and Post-Conflict Safety</w:t>
+        <w:t>The MINE Framework (Mapping Is Not Exposure): Transparent Minefield Maps with Dummy Positions for Reconciling Military Utility and Post-Conflict Safety</w:t>
       </w:r>
     </w:p>
     <w:p/>
@@ -48,7 +48,7 @@
     </w:p>
     <w:p>
       <w:r>
-        <w:t>This paper proposes a novel regulatory framework for anti-personnel mines wherein defending states publish position maps containing both real mine locations and indistinguishable dummy positions. The dummy-to-real ratio r serves as a treaty-tuneable parameter balancing military effectiveness against humanitarian cost. Game-theoretic analysis demonstrates that rational attackers will clear all marked positions for any policy-relevant r, preserving full breach delay. The zero-residual property guarantees complete post-conflict clearance without reliance on detection technology. Numerical simulations calibrated to Baltic frontier scenarios illustrate practical application for NATO states now withdrawing from the Ottawa Convention.</w:t>
+        <w:t>This paper proposes the MINE framework (Mapping Is Not Exposure): a regulatory regime for anti-personnel mines wherein defending states publish position maps containing both real mine locations and indistinguishable dummy positions. The dummy-to-real ratio r serves as a treaty-tuneable parameter balancing military effectiveness against humanitarian cost. Game-theoretic analysis demonstrates that rational attackers will clear all marked positions for any policy-relevant r, preserving full breach delay. The zero-residual property guarantees complete post-conflict clearance without reliance on detection technology. Numerical simulations calibrated to Baltic frontier scenarios illustrate practical application for NATO states now withdrawing from the Ottawa Convention.</w:t>
       </w:r>
     </w:p>
     <w:p/>
@@ -60,7 +60,7 @@
         <w:t xml:space="preserve">Keywords: </w:t>
       </w:r>
       <w:r>
-        <w:t>anti-personnel mines; Ottawa Convention; game theory; area denial; post-conflict clearance; Baltic security; information asymmetry; treaty design; NATO; deterrence</w:t>
+        <w:t>anti-personnel mines; MINE framework; Ottawa Convention; game theory; area denial; post-conflict clearance; Baltic security; information asymmetry; treaty design; NATO; deterrence</w:t>
       </w:r>
     </w:p>
     <w:p>
@@ -88,16 +88,16 @@
     </w:p>
     <w:p>
       <w:r>
-        <w:t>This paper fills that gap. We propose a novel regulatory framework—</w:t>
+        <w:t xml:space="preserve">This paper fills that gap. We propose a novel regulatory framework that we term </w:t>
       </w:r>
       <w:r>
         <w:rPr>
           <w:b/>
         </w:rPr>
-        <w:t>transparent minefield mapping with controlled dummy positions</w:t>
-      </w:r>
-      <w:r>
-        <w:t xml:space="preserve">—that gives concrete operational meaning to “responsible use.” Under this framework, a defending state must publish a map showing all mine positions before or during deployment. Crucially, the map may include dummy (decoy) positions: locations marked as potentially mined but containing no actual ordnance. The ratio of dummy to real positions (the </w:t>
+        <w:t>MINE (Mapping Is Not Exposure)</w:t>
+      </w:r>
+      <w:r>
+        <w:t xml:space="preserve">—reflecting the core insight that publishing minefield positions with dummy entries does not constitute military exposure. The MINE framework gives concrete operational meaning to “responsible use.” Under this framework, a defending state must publish a map showing all mine positions before or during deployment. Crucially, the map may include dummy (decoy) positions: locations marked as potentially mined but containing no actual ordnance. The ratio of dummy to real positions (the </w:t>
       </w:r>
       <w:r>
         <w:rPr>
@@ -130,12 +130,12 @@
     </w:p>
     <w:p>
       <w:r>
-        <w:t>The urgency of this contribution is underscored by the current policy vacuum. As of mid-2025, five NATO states have announced withdrawal from the Ottawa Convention, all pledging responsible use, yet no common framework exists to define what this means. Without agreed operational standards, each withdrawing state will develop its own practices—potentially divergent, potentially opaque, and potentially contributing to the very humanitarian outcomes the Ottawa Convention sought to prevent. The transparent map framework offers a ready-made standard that could be adopted immediately.</w:t>
+        <w:t>The urgency of this contribution is underscored by the current policy vacuum. As of mid-2025, five NATO states have announced withdrawal from the Ottawa Convention, all pledging responsible use, yet no common framework exists to define what this means. Without agreed operational standards, each withdrawing state will develop its own practices—potentially divergent, potentially opaque, and potentially contributing to the very humanitarian outcomes the Ottawa Convention sought to prevent. The MINE framework offers a ready-made standard that could be adopted immediately.</w:t>
       </w:r>
     </w:p>
     <w:p>
       <w:r>
-        <w:t>The remainder of this paper is structured as follows. Section 2 reviews existing regulatory frameworks and their limitations. Section 3 presents the formal model. Section 4 analyses military effectiveness under the transparent map regime. Section 5 examines post-conflict safety guarantees. Section 6 develops game-theoretic and information-theoretic properties. Section 7 discusses treaty design implications, including verification mechanisms and compatibility with existing frameworks. Section 8 applies the model to the Baltic security context with scenario analysis. Section 9 discusses limitations, and Section 10 concludes with policy recommendations.</w:t>
+        <w:t>The remainder of this paper is structured as follows. Section 2 reviews existing regulatory frameworks and their limitations. Section 3 presents the formal model. Section 4 analyses military effectiveness under the MINE regime. Section 5 examines post-conflict safety guarantees. Section 6 develops game-theoretic and information-theoretic properties. Section 7 discusses treaty design implications, including verification mechanisms and compatibility with existing frameworks. Section 8 applies the model to the Baltic security context with scenario analysis. Section 9 discusses limitations, and Section 10 concludes with policy recommendations.</w:t>
       </w:r>
     </w:p>
     <w:p>
@@ -189,7 +189,7 @@
     </w:p>
     <w:p>
       <w:r>
-        <w:t>However, the Protocol has three significant limitations that the transparent map framework addresses:</w:t>
+        <w:t>However, the Protocol has three significant limitations that the MINE framework addresses:</w:t>
       </w:r>
     </w:p>
     <w:p>
@@ -200,7 +200,7 @@
         <w:t xml:space="preserve">First, self-destruct unreliability. </w:t>
       </w:r>
       <w:r>
-        <w:t>The Protocol’s requirement for self-destruct mechanisms assumes reliable functioning. Field evidence tells a different story. The Norwegian People’s Aid (2007) study of the M85 submunition—widely cited as incorporating a “high-quality” self-destruct mechanism—found field failure rates substantially exceeding laboratory specifications. The CCW Protocol itself permits a 10% failure rate. In a field of 1,000 mines, this leaves 100 active mines—each capable of killing or maiming for decades. The transparent map framework does not depend on mechanical reliability; its safety guarantee is deterministic.</w:t>
+        <w:t>The Protocol’s requirement for self-destruct mechanisms assumes reliable functioning. Field evidence tells a different story. The Norwegian People’s Aid (2007) study of the M85 submunition—widely cited as incorporating a “high-quality” self-destruct mechanism—found field failure rates substantially exceeding laboratory specifications. The CCW Protocol itself permits a 10% failure rate. In a field of 1,000 mines, this leaves 100 active mines—each capable of killing or maiming for decades. The MINE framework does not depend on mechanical reliability; its safety guarantee is deterministic.</w:t>
       </w:r>
     </w:p>
     <w:p>
@@ -222,7 +222,7 @@
         <w:t xml:space="preserve">Third, post-conflict timing. </w:t>
       </w:r>
       <w:r>
-        <w:t>The Protocol’s recording requirement (Article 7) applies only after cessation of hostilities. During conflict, mine positions may be lost due to destroyed records, personnel casualties, or deliberate concealment. The transparent map framework requires publication during or before deployment, creating an irrevocable record.</w:t>
+        <w:t>The Protocol’s recording requirement (Article 7) applies only after cessation of hostilities. During conflict, mine positions may be lost due to destroyed records, personnel casualties, or deliberate concealment. The MINE framework requires publication during or before deployment, creating an irrevocable record.</w:t>
       </w:r>
     </w:p>
     <w:p>
@@ -330,7 +330,7 @@
     </w:p>
     <w:p>
       <w:r>
-        <w:t>Consider a defending state that emplaces a minefield along a front of width W (metres) to a depth D (metres), with total area A = W × D. The minefield contains N real anti-personnel mines distributed across this area. Under the proposed regime, the defender publishes a map to an international registry showing M = N(1 + r) marked positions, where r ≥ 0 is the dummy ratio. Of these, exactly N contain real mines and Nr are dummies.</w:t>
+        <w:t>Consider a defending state that emplaces a minefield along a front of width W (metres) to a depth D (metres), with total area A = W × D. The minefield contains N real anti-personnel mines distributed across this area. Under the proposed regime, the defender publishes a map to the MINE Registry showing M = N(1 + r) marked positions, where r ≥ 0 is the dummy ratio. Of these, exactly N contain real mines and Nr are dummies.</w:t>
       </w:r>
     </w:p>
     <w:p>
@@ -760,7 +760,7 @@
         <w:t xml:space="preserve">Figure 1. </w:t>
       </w:r>
       <w:r>
-        <w:t>Conceptual comparison of three information regimes. (a) No map (status quo): mine positions unknown, entire area uncertain. (b) Full intelligence: all real positions known to attacker. (c) Proposed regime: map published with real + dummy positions; identity (real vs dummy) unknown to attacker.</w:t>
+        <w:t>Conceptual comparison of three information regimes. (a) No map (status quo): mine positions unknown, entire area uncertain. (b) Full intelligence: all real positions known to attacker. (c) MINE regime: map published with real + dummy positions; identity (real vs dummy) unknown to attacker.</w:t>
       </w:r>
     </w:p>
     <w:p>
@@ -1719,7 +1719,7 @@
         <w:t xml:space="preserve">Figure 2. </w:t>
       </w:r>
       <w:r>
-        <w:t>Attacker breach delay as a function of dummy ratio r (baseline scenario). Solid blue: proposed regime, scaling linearly with (1+r). Red dashed: blind sweep (no map, 600 min). Green dotted: full intelligence (12 min).</w:t>
+        <w:t>Attacker breach delay as a function of dummy ratio r (baseline scenario). Solid blue: MINE regime, scaling linearly with (1+r). Red dashed: blind sweep (no map, 600 min). Green dotted: full intelligence (12 min).</w:t>
       </w:r>
     </w:p>
     <w:p>
@@ -1765,7 +1765,7 @@
     </w:p>
     <w:p>
       <w:r>
-        <w:t xml:space="preserve">Under the no-map regime, an attacker who chooses to accept casualties faces an unknown risk distributed over an unknown area. Under the transparent map regime, the same attacker faces </w:t>
+        <w:t xml:space="preserve">Under the no-map regime, an attacker who chooses to accept casualties faces an unknown risk distributed over an unknown area. Under the MINE regime, the same attacker faces </w:t>
       </w:r>
       <w:r>
         <w:rPr>
@@ -1804,7 +1804,7 @@
     </w:p>
     <w:p>
       <w:r>
-        <w:t xml:space="preserve">The most significant humanitarian advantage of the transparent map regime is what we term the </w:t>
+        <w:t xml:space="preserve">The most significant humanitarian advantage of the MINE regime is what we term the </w:t>
       </w:r>
       <w:r>
         <w:rPr>
@@ -2013,7 +2013,7 @@
     </w:p>
     <w:p>
       <w:r>
-        <w:t>Table 4 compares the transparent map regime with self-destruct mechanisms across key safety dimensions.</w:t>
+        <w:t>Table 4 compares the MINE regime with self-destruct mechanisms across key safety dimensions.</w:t>
       </w:r>
     </w:p>
     <w:tbl>
@@ -2368,7 +2368,7 @@
     </w:p>
     <w:p>
       <w:r>
-        <w:t>For the baseline scenario: H_A ≈ 1,934 bits (no map); H_C(5) ≈ 780 bits (40% of maximum); H_C(10) ≈ 967 bits (50%). The transparent map regime thus allows the defender to retain 20–50% of maximum positional uncertainty at policy-relevant dummy ratios, whilst guaranteeing post-conflict clearance.</w:t>
+        <w:t>For the baseline scenario: H_A ≈ 1,934 bits (no map); H_C(5) ≈ 780 bits (40% of maximum); H_C(10) ≈ 967 bits (50%). The MINE regime thus allows the defender to retain 20–50% of maximum positional uncertainty at policy-relevant dummy ratios, whilst guaranteeing post-conflict clearance.</w:t>
       </w:r>
     </w:p>
     <w:p>
@@ -2426,7 +2426,7 @@
         <w:t xml:space="preserve">Figure 4. </w:t>
       </w:r>
       <w:r>
-        <w:t>Positional entropy (Shannon information) representing attacker uncertainty. Purple: transparent map regime. Red dashed: no-map maximum (1,934 bits). The regime provides controlled uncertainty between 0 and 50% of maximum at policy-relevant r values.</w:t>
+        <w:t>Positional entropy (Shannon information) representing attacker uncertainty. Purple: MINE regime. Red dashed: no-map maximum (1,934 bits). The regime provides controlled uncertainty between 0 and 50% of maximum at policy-relevant r values.</w:t>
       </w:r>
     </w:p>
     <w:p>
@@ -2890,7 +2890,7 @@
         <w:t xml:space="preserve">Figure 5. </w:t>
       </w:r>
       <w:r>
-        <w:t>Policy trade-off space: military utility (normalised breach delay, y-axis) vs post-conflict clearance cost (normalised, x-axis). Colour: dummy ratio r. The proposed regime traces a curve from full information (origin) toward the status quo (upper right), with each r value representing a specific policy choice.</w:t>
+        <w:t>Policy trade-off space: military utility (normalised breach delay, y-axis) vs post-conflict clearance cost (normalised, x-axis). Colour: dummy ratio r. The MINE regime traces a curve from full information (origin) toward the status quo (upper right), with each r value representing a specific policy choice.</w:t>
       </w:r>
     </w:p>
     <w:p>
@@ -2903,7 +2903,7 @@
     </w:p>
     <w:p>
       <w:r>
-        <w:t>The transparent map regime is inherently more verifiable than existing arrangements. Three mechanisms enable compliance monitoring:</w:t>
+        <w:t>The MINE regime is inherently more verifiable than existing arrangements. Three mechanisms enable compliance monitoring:</w:t>
       </w:r>
     </w:p>
     <w:p>
@@ -2955,10 +2955,10 @@
         <w:rPr>
           <w:i/>
         </w:rPr>
-        <w:t>registry</w:t>
-      </w:r>
-      <w:r>
-        <w:t>—a secure, append-only database maintained by a trusted third party (NATO Communications and Information Agency, ICRC, or a dedicated international body) to which deploying states submit position maps. The registry must accept map submissions (new minefield declarations) and supplements (additional positions added during conflict) but must not permit deletions or modifications of previously submitted entries. This append-only property preserves the completeness guarantee: if a state registers positions, they cannot later remove entries to conceal violations.</w:t>
+        <w:t>the MINE Registry</w:t>
+      </w:r>
+      <w:r>
+        <w:t>—a secure, append-only database maintained by a trusted third party (NATO Communications and Information Agency, ICRC, or a dedicated international body) to which deploying states submit position maps. The MINE Registry must accept map submissions (new minefield declarations) and supplements (additional positions added during conflict) but must not permit deletions or modifications of previously submitted entries. This append-only property preserves the completeness guarantee: if a state registers positions, they cannot later remove entries to conceal violations.</w:t>
       </w:r>
     </w:p>
     <w:p>
@@ -2969,7 +2969,7 @@
         <w:rPr>
           <w:i/>
         </w:rPr>
-        <w:t>verification protocol</w:t>
+        <w:t>the MINE verification protocol</w:t>
       </w:r>
       <w:r>
         <w:t>—procedures for confirming compliance both during and after conflict. During conflict, satellite imagery can verify that marked positions show ground disturbance consistent with emplacement. After conflict, clearance operations record whether each position contained a real mine or was dummy, enabling verification of the declared ratio.</w:t>
@@ -2999,7 +2999,7 @@
     </w:p>
     <w:p>
       <w:r>
-        <w:t>The proposed framework is designed to complement CCW Amended Protocol II. It extends the Protocol’s Article 7 recording requirements by: (a) mandating publication during deployment rather than only post-conflict; and (b) formalising the dummy position concept with a regulated ratio. States remaining within the CCW framework could adopt the transparent map as an additional protocol or as a NATO-internal standard.</w:t>
+        <w:t>The proposed framework is designed to complement CCW Amended Protocol II. It extends the Protocol’s Article 7 recording requirements by: (a) mandating publication during deployment rather than only post-conflict; and (b) formalising the dummy position concept with a regulated ratio. States remaining within the CCW framework could adopt the MINE Protocol as an additional protocol or as a NATO-internal standard.</w:t>
       </w:r>
     </w:p>
     <w:p>
@@ -3113,7 +3113,7 @@
     </w:p>
     <w:p>
       <w:r>
-        <w:t>The Baltic states face a specific threat model that makes the transparent map framework particularly appropriate. Estonia, Latvia, and Lithuania share borders with Russia (and Belarus); face a significant conventional force imbalance; rely on delay and area denial to enable NATO reinforcement (which may require 10–30 days); and have limited territory depth, making every hour of delay operationally significant.</w:t>
+        <w:t>The Baltic states face a specific threat model that makes the MINE framework particularly appropriate. Estonia, Latvia, and Lithuania share borders with Russia (and Belarus); face a significant conventional force imbalance; rely on delay and area denial to enable NATO reinforcement (which may require 10–30 days); and have limited territory depth, making every hour of delay operationally significant.</w:t>
       </w:r>
     </w:p>
     <w:p>
@@ -3131,7 +3131,7 @@
     </w:p>
     <w:p>
       <w:r>
-        <w:t>Russia’s use of mines in Ukraine since 2022 provides empirical evidence directly relevant to the Baltic scenario. Three observations are pertinent. First, Russia has deployed mines extensively without recording or marking, creating a humanitarian crisis that will persist for decades—exactly the outcome the transparent map framework prevents. Second, Ukrainian breach operations against Russian minefields confirm that clearance under fire imposes delays of 1–4 hours per corridor even with modern equipment, validating our model’s delay estimates. Third, the scale of post-conflict clearance required in Ukraine—estimated at 30% of the country’s territory—demonstrates the catastrophic humanitarian cost of unmapped mine deployment, providing a powerful policy argument for the transparent alternative.</w:t>
+        <w:t>Russia’s use of mines in Ukraine since 2022 provides empirical evidence directly relevant to the Baltic scenario. Three observations are pertinent. First, Russia has deployed mines extensively without recording or marking, creating a humanitarian crisis that will persist for decades—exactly the outcome the MINE framework prevents. Second, Ukrainian breach operations against Russian minefields confirm that clearance under fire imposes delays of 1–4 hours per corridor even with modern equipment, validating our model’s delay estimates. Third, the scale of post-conflict clearance required in Ukraine—estimated at 30% of the country’s territory—demonstrates the catastrophic humanitarian cost of unmapped mine deployment, providing a powerful policy argument for the transparent alternative.</w:t>
       </w:r>
     </w:p>
     <w:p>
@@ -3201,7 +3201,7 @@
     </w:p>
     <w:p>
       <w:r>
-        <w:t>The transparent map regime has an additional deterrence property: the published map itself serves as a credible signal of defensive preparation. Unlike hidden minefields (which the adversary may doubt exist) or announced but unverified deployments (which may be bluffs), a registered map with specific coordinates is a verifiable commitment. This enhances deterrence by eliminating uncertainty about whether defensive preparations have actually been made.</w:t>
+        <w:t>The MINE regime has an additional deterrence property: the published map itself serves as a credible signal of defensive preparation. Unlike hidden minefields (which the adversary may doubt exist) or announced but unverified deployments (which may be bluffs), a registered map with specific coordinates is a verifiable commitment. This enhances deterrence by eliminating uncertainty about whether defensive preparations have actually been made.</w:t>
       </w:r>
     </w:p>
     <w:p>
@@ -3225,7 +3225,7 @@
         <w:t xml:space="preserve">Estonia. </w:t>
       </w:r>
       <w:r>
-        <w:t>Estonia’s land border with Russia is approximately 294 km, of which significant portions pass through terrain suitable for defensive mining (forests, wetlands, narrow corridors between Lake Peipus and the Gulf of Finland). The Estonian Defence Forces have identified specific invasion corridors where delay is most critical—particularly the Narva corridor in the northeast. With a population of 1.3 million and limited strategic depth (Tallinn is 200 km from the Russian border), every hour of delay at the border is operationally decisive. The transparent map framework at r = 7–10 would provide 1.5–2.2 hours of delay per corridor whilst maintaining Estonia’s commitment to humanitarian mine use—a commitment explicitly stated during the 2024 National Defence Committee deliberations.</w:t>
+        <w:t>Estonia’s land border with Russia is approximately 294 km, of which significant portions pass through terrain suitable for defensive mining (forests, wetlands, narrow corridors between Lake Peipus and the Gulf of Finland). The Estonian Defence Forces have identified specific invasion corridors where delay is most critical—particularly the Narva corridor in the northeast. With a population of 1.3 million and limited strategic depth (Tallinn is 200 km from the Russian border), every hour of delay at the border is operationally decisive. The MINE framework at r = 7–10 would provide 1.5–2.2 hours of delay per corridor whilst maintaining Estonia’s commitment to humanitarian mine use—a commitment explicitly stated during the 2024 National Defence Committee deliberations.</w:t>
       </w:r>
     </w:p>
     <w:p>
@@ -3247,7 +3247,7 @@
         <w:t xml:space="preserve">Finland. </w:t>
       </w:r>
       <w:r>
-        <w:t>Finland’s 1,340 km border with Russia—NATO’s longest—presents a different operational calculus. The vast length makes comprehensive mining impractical; instead, selective deployment at key choke points (road crossings, defiles, bridges) is the likely operational concept. Finland’s extensive Cold War experience with landmines (over 1 million destroyed after Ottawa ratification) provides institutional knowledge for implementing the transparent map framework. The Finnish Defence Forces’ doctrine of territorial defence, which emphasises delay and attrition over decisive engagement, aligns naturally with a framework designed to maximise delay per mine deployed.</w:t>
+        <w:t>Finland’s 1,340 km border with Russia—NATO’s longest—presents a different operational calculus. The vast length makes comprehensive mining impractical; instead, selective deployment at key choke points (road crossings, defiles, bridges) is the likely operational concept. Finland’s extensive Cold War experience with landmines (over 1 million destroyed after Ottawa ratification) provides institutional knowledge for implementing the MINE framework. The Finnish Defence Forces’ doctrine of territorial defence, which emphasises delay and attrition over decisive engagement, aligns naturally with a framework designed to maximise delay per mine deployed.</w:t>
       </w:r>
     </w:p>
     <w:p>
@@ -3293,7 +3293,7 @@
         <w:t xml:space="preserve">• Conventional obstacles </w:t>
       </w:r>
       <w:r>
-        <w:t>(wire, ditches, concrete barriers) are visible, predictable, and can be planned around. The transparent map framework preserves the key advantage of mines: uncertainty about which specific positions are lethal, forcing the attacker to treat all as dangerous.</w:t>
+        <w:t>(wire, ditches, concrete barriers) are visible, predictable, and can be planned around. The MINE framework preserves the key advantage of mines: uncertainty about which specific positions are lethal, forcing the attacker to treat all as dangerous.</w:t>
       </w:r>
     </w:p>
     <w:p>
@@ -3306,7 +3306,7 @@
     </w:p>
     <w:p>
       <w:r>
-        <w:t>The Ottawa Convention requires twelve months between notification and effective withdrawal. This creates an implementation window during which withdrawing states can develop operational procedures for the transparent map framework. A realistic timeline would be:</w:t>
+        <w:t>The Ottawa Convention requires twelve months between notification and effective withdrawal. This creates an implementation window during which withdrawing states can develop operational procedures for the MINE framework. A realistic timeline would be:</w:t>
       </w:r>
     </w:p>
     <w:p>
@@ -3363,7 +3363,7 @@
     </w:p>
     <w:p>
       <w:r>
-        <w:t>The transparent map framework is well-suited for adoption as a NATO standard (STANAG). Its advantages for alliance-wide implementation include: (a) interoperability—allied forces can access the published map for safe passage; (b) burden-sharing—post-conflict clearance can be allocated to any NATO engineer unit with the map; (c) political legitimacy—adoption as a NATO standard demonstrates collective commitment to humanitarian norms even while re-introducing mines for defensive purposes.</w:t>
+        <w:t>The MINE framework is well-suited for adoption as a NATO standard (STANAG). Its advantages for alliance-wide implementation include: (a) interoperability—allied forces can access the published map for safe passage; (b) burden-sharing—post-conflict clearance can be allocated to any NATO engineer unit with the map; (c) political legitimacy—adoption as a NATO standard demonstrates collective commitment to humanitarian norms even while re-introducing mines for defensive purposes.</w:t>
       </w:r>
     </w:p>
     <w:p>
@@ -3409,7 +3409,7 @@
     </w:p>
     <w:p>
       <w:r>
-        <w:t>A critical question arises in non-international armed conflicts: if only the state actor publishes a transparent map while the non-state adversary operates at r = ∞ (no disclosure), does this create an exploitable asymmetry? The concern is that the government’s maps reveal information about defensive dispositions while rebel forces retain full uncertainty.</w:t>
+        <w:t>A critical question arises in non-international armed conflicts: if only the state actor publishes under the MINE regime while the non-state adversary operates at r = ∞ (no disclosure), does this create an exploitable asymmetry? The concern is that the government’s maps reveal information about defensive dispositions while rebel forces retain full uncertainty.</w:t>
       </w:r>
     </w:p>
     <w:p>
@@ -3470,7 +3470,7 @@
     </w:p>
     <w:p>
       <w:r>
-        <w:t xml:space="preserve">Substituting baseline parameters: r* = (5000 × 300 × 5) / (200 × 30 × 25) − 1 = 50 − 1 = 49. At r = 49, the transparent map regime imposes </w:t>
+        <w:t xml:space="preserve">Substituting baseline parameters: r* = (5000 × 300 × 5) / (200 × 30 × 25) − 1 = 50 − 1 = 49. At r = 49, the MINE regime imposes </w:t>
       </w:r>
       <w:r>
         <w:rPr>
@@ -3529,12 +3529,12 @@
     </w:p>
     <w:p>
       <w:r>
-        <w:t>The proposed framework applies exclusively to state actors operating within the law of armed conflict. Non-state armed groups (NSAGs) and terrorist organisations remain outside the scope of treaty-based regulation—a limitation shared with all existing instruments including the Ottawa Convention and CCW Amended Protocol II. However, this shared limitation does not preclude complementary mechanisms specifically addressing non-state mine use.</w:t>
+        <w:t>The MINE framework applies exclusively to state actors operating within the law of armed conflict. Non-state armed groups (NSAGs) and terrorist organisations remain outside the scope of treaty-based regulation—a limitation shared with all existing instruments including the Ottawa Convention and CCW Amended Protocol II. However, this shared limitation does not preclude complementary mechanisms specifically addressing non-state mine use.</w:t>
       </w:r>
     </w:p>
     <w:p>
       <w:r>
-        <w:t>We propose a Collective Response Mechanism (CRM) as an institutional complement to the transparent map framework. The CRM would operate on three principles:</w:t>
+        <w:t>We propose a Collective Response Mechanism (CRM) as an institutional complement to the MINE framework. The CRM would operate on three principles:</w:t>
       </w:r>
     </w:p>
     <w:p>
@@ -3567,12 +3567,12 @@
         <w:t xml:space="preserve">Third, differentiated legitimacy: </w:t>
       </w:r>
       <w:r>
-        <w:t>the framework establishes a clear legal and normative distinction between “responsible use” (states publishing transparent maps within the regulated r parameter) and “irresponsible use” (any mine deployment without position disclosure). This binary classification strengthens the normative case against NSAG mine use by providing a concrete, verifiable standard of responsible behaviour that NSAGs manifestly fail to meet. It also provides legal clarity for states re-introducing mines: compliance with the transparent map protocol demonstrates good faith commitment to humanitarian norms, insulating compliant states from the stigma associated with indiscriminate mine use.</w:t>
+        <w:t>the framework establishes a clear legal and normative distinction between “responsible use” (states publishing transparent maps within the regulated r parameter) and “irresponsible use” (any mine deployment without position disclosure). This binary classification strengthens the normative case against NSAG mine use by providing a concrete, verifiable standard of responsible behaviour that NSAGs manifestly fail to meet. It also provides legal clarity for states re-introducing mines: compliance with the MINE Protocol demonstrates good faith commitment to humanitarian norms, insulating compliant states from the stigma associated with indiscriminate mine use.</w:t>
       </w:r>
     </w:p>
     <w:p>
       <w:r>
-        <w:t>Precedent for such mechanisms exists. The Geneva Call initiative has secured “Deeds of Commitment” from over 60 non-state armed groups pledging mine non-use—demonstrating that normative pressure can reach beyond treaty law. The transparent map framework strengthens this norm by making the distinction between responsible and irresponsible use operationally concrete and externally verifiable.</w:t>
+        <w:t>Precedent for such mechanisms exists. The Geneva Call initiative has secured “Deeds of Commitment” from over 60 non-state armed groups pledging mine non-use—demonstrating that normative pressure can reach beyond treaty law. The MINE framework strengthens this norm by making the distinction between responsible and irresponsible use operationally concrete and externally verifiable.</w:t>
       </w:r>
     </w:p>
     <w:p>
@@ -3590,7 +3590,7 @@
     </w:p>
     <w:p>
       <w:r>
-        <w:t xml:space="preserve">The transparent map framework resolves this problem by design. Because maps are </w:t>
+        <w:t xml:space="preserve">The MINE framework resolves this problem by design. Because maps are </w:t>
       </w:r>
       <w:r>
         <w:rPr>
@@ -3632,7 +3632,7 @@
         <w:t xml:space="preserve">Territory recaptured: </w:t>
       </w:r>
       <w:r>
-        <w:t>If the adversary also operated under the transparent map regime, their published positions enable systematic clearance of enemy-emplaced mines in recaptured territory. If the adversary did not publish (non-signatory or non-state actor), the recapturing state faces the same blind-sweep problem as under the status quo—but its own mines remain fully mapped and clearable.</w:t>
+        <w:t>If the adversary also operated under the MINE regime, their published positions enable systematic clearance of enemy-emplaced mines in recaptured territory. If the adversary did not publish (non-signatory or non-state actor), the recapturing state faces the same blind-sweep problem as under the status quo—but its own mines remain fully mapped and clearable.</w:t>
       </w:r>
     </w:p>
     <w:p>
@@ -3658,7 +3658,7 @@
     </w:p>
     <w:p>
       <w:r>
-        <w:t>Finally, the political feasibility of gaining acceptance for any framework that legitimises mine use—however constrained—should not be underestimated. The Ottawa Convention’s norm-setting achievement has created strong institutional resistance to any proposal perceived as weakening the prohibition. We argue that the transparent map framework should be positioned not as a weakening but as a strengthening of post-conflict humanitarian outcomes: it provides a safety guarantee (zero residual) that even full Ottawa compliance cannot offer for states that withdraw and use mines without constraints.</w:t>
+        <w:t>Finally, the political feasibility of gaining acceptance for any framework that legitimises mine use—however constrained—should not be underestimated. The Ottawa Convention’s norm-setting achievement has created strong institutional resistance to any proposal perceived as weakening the prohibition. We argue that the MINE framework should be positioned not as a weakening but as a strengthening of post-conflict humanitarian outcomes: it provides a safety guarantee (zero residual) that even full Ottawa compliance cannot offer for states that withdraw and use mines without constraints.</w:t>
       </w:r>
     </w:p>
     <w:p>
@@ -3671,7 +3671,7 @@
     </w:p>
     <w:p>
       <w:r>
-        <w:t>This paper has presented a novel regulatory framework for anti-personnel mines that reconciles military utility with humanitarian guarantees through a single, tuneable parameter: the dummy ratio r. The framework transforms the binary choice between total prohibition (Ottawa Convention) and unrestricted use into a continuum of policy options that can be tailored to specific security contexts and negotiated through treaty mechanisms.</w:t>
+        <w:t>This paper has presented the MINE framework (Mapping Is Not Exposure) for anti-personnel mines, reconciling military utility with humanitarian guarantees through a single, tuneable parameter: the dummy ratio r. The MINE framework transforms the binary choice between total prohibition (Ottawa Convention) and unrestricted use into a continuum of policy options that can be tailored to specific security contexts and negotiated through treaty mechanisms.</w:t>
       </w:r>
     </w:p>
     <w:p>
@@ -3737,7 +3737,7 @@
     </w:p>
     <w:p>
       <w:r>
-        <w:t xml:space="preserve">This unilateral benefit structure has profound implications for treaty adoption dynamics. Classical arms control faces a prisoner’s dilemma: each state benefits from others’ compliance but is tempted to defect. The transparent map framework inverts this logic. A state benefits from its </w:t>
+        <w:t xml:space="preserve">This unilateral benefit structure has profound implications for treaty adoption dynamics. Classical arms control faces a prisoner’s dilemma: each state benefits from others’ compliance but is tempted to defect. The MINE framework inverts this logic. A state benefits from its </w:t>
       </w:r>
       <w:r>
         <w:rPr>
@@ -3751,12 +3751,12 @@
     </w:p>
     <w:p>
       <w:r>
-        <w:t>For the Baltic states and Finland, this framework provides an operationally credible middle path at a critical juncture. Rather than returning to unrestricted mine use (accepting humanitarian costs) or remaining within a prohibition that sacrifices military utility (accepting security costs), these states could adopt the transparent map regime as a NATO-wide standard. In doing so, they would demonstrate that responsible deterrence and humanitarian norms are not merely compatible but complementary—that publishing a minefield map is simultaneously an act of military preparation and an act of humanitarian commitment.</w:t>
+        <w:t>For the Baltic states and Finland, this framework provides an operationally credible middle path at a critical juncture. Rather than returning to unrestricted mine use (accepting humanitarian costs) or remaining within a prohibition that sacrifices military utility (accepting security costs), these states could adopt the MINE regime as a NATO-wide standard. In doing so, they would demonstrate that responsible deterrence and humanitarian norms are not merely compatible but complementary—that publishing a minefield map is simultaneously an act of military preparation and an act of humanitarian commitment.</w:t>
       </w:r>
     </w:p>
     <w:p>
       <w:r>
-        <w:t>The policy window for adoption is narrow but open. With five NATO states in various stages of Ottawa Convention withdrawal, the next 12–24 months will determine whether these states develop individual, potentially divergent mine employment practices or converge on a common standard. The transparent map framework offers an immediate, implementable standard requiring no new technology, no novel legal instruments beyond existing CCW mechanisms, and no compromise of either military utility or humanitarian principles.</w:t>
+        <w:t>The policy window for adoption is narrow but open. With five NATO states in various stages of Ottawa Convention withdrawal, the next 12–24 months will determine whether these states develop individual, potentially divergent mine employment practices or converge on a common standard. The MINE framework offers an immediate, implementable standard requiring no new technology, no novel legal instruments beyond existing CCW mechanisms, and no compromise of either military utility or humanitarian principles.</w:t>
       </w:r>
     </w:p>
     <w:p>
@@ -3766,12 +3766,12 @@
     </w:p>
     <w:p>
       <w:r>
-        <w:t>We note that the framework is immediately implementable using existing technology and legal mechanisms. No novel mine designs, no new sensors, and no untested verification technologies are required. The only innovation is informational: the commitment to publish a map, and the agreement on how many positions it may contain. This simplicity is a feature, not a limitation—it means adoption can proceed in parallel with the withdrawal process, providing operational standards from day one of resumed mine use.</w:t>
+        <w:t>We note that the MINE framework is immediately implementable using existing technology and legal mechanisms. No novel mine designs, no new sensors, and no untested verification technologies are required. The only innovation is informational: the commitment to publish a map, and the agreement on how many positions it may contain. This simplicity is a feature, not a limitation—it means adoption can proceed in parallel with the withdrawal process, providing operational standards from day one of resumed mine use.</w:t>
       </w:r>
     </w:p>
     <w:p>
       <w:r>
-        <w:t xml:space="preserve">The transparent minefield is, ultimately, an information-theoretic innovation applied to a humanitarian problem. It recognises that the harm caused by landmines is not only physical but informational: it is the </w:t>
+        <w:t xml:space="preserve">The MINE framework is, ultimately, an information-theoretic innovation applied to a humanitarian problem. It recognises that the harm caused by landmines is not only physical but informational: it is the </w:t>
       </w:r>
       <w:r>
         <w:rPr>
@@ -3780,7 +3780,7 @@
         <w:t>uncertainty</w:t>
       </w:r>
       <w:r>
-        <w:t xml:space="preserve"> about mine locations that makes post-conflict land unusable and clearance so expensive. By structuring that uncertainty as a controlled parameter—published, bounded, and treaty-regulated—the framework converts an intractable post-conflict problem into a finite, plannable task with a guaranteed end state.</w:t>
+        <w:t xml:space="preserve"> about mine locations that makes post-conflict land unusable and clearance so expensive. By structuring that uncertainty as a controlled parameter—published, bounded, and treaty-regulated—the MINE framework converts an intractable post-conflict problem into a finite, plannable task with a guaranteed end state.</w:t>
       </w:r>
     </w:p>
     <w:p>

</xml_diff>

<commit_message>
Fix grammar errors and remaining terminology inconsistencies
- Remove 'the' from 'a the MINE Registry' and 'a the MINE verification protocol'
- Update Regime C label to 'MINE regime (0 < r < ∞)'
- Update table header: 'Transparent map (proposed)' → 'MINE framework (proposed)'
- Update 'Map-based clearance (proposed regime)' → '(MINE regime)'
- Update 'Under the proposed regime' → 'Under the MINE regime'
- Update 'The proposed framework is designed' → 'The MINE framework is designed'

Word count: 9,041

Co-Authored-By: Tatsuki Onishi <bougtoir@gmail.com>
</commit_message>
<xml_diff>
--- a/landmine_transparent_map/output/manuscript_JoBS.docx
+++ b/landmine_transparent_map/output/manuscript_JoBS.docx
@@ -330,7 +330,7 @@
     </w:p>
     <w:p>
       <w:r>
-        <w:t>Consider a defending state that emplaces a minefield along a front of width W (metres) to a depth D (metres), with total area A = W × D. The minefield contains N real anti-personnel mines distributed across this area. Under the proposed regime, the defender publishes a map to the MINE Registry showing M = N(1 + r) marked positions, where r ≥ 0 is the dummy ratio. Of these, exactly N contain real mines and Nr are dummies.</w:t>
+        <w:t>Consider a defending state that emplaces a minefield along a front of width W (metres) to a depth D (metres), with total area A = W × D. The minefield contains N real anti-personnel mines distributed across this area. Under the MINE regime, the defender publishes a map to the MINE Registry showing M = N(1 + r) marked positions, where r ≥ 0 is the dummy ratio. Of these, exactly N contain real mines and Nr are dummies.</w:t>
       </w:r>
     </w:p>
     <w:p>
@@ -704,7 +704,7 @@
         <w:rPr>
           <w:b/>
         </w:rPr>
-        <w:t xml:space="preserve">Regime C – Transparent map with dummies (proposed, 0 &lt; r &lt; ∞): </w:t>
+        <w:t xml:space="preserve">Regime C – MINE regime (0 &lt; r &lt; ∞): </w:t>
       </w:r>
       <w:r>
         <w:t>The attacker has the published map showing M = N(1+r) positions. They know N mines exist among the M positions but cannot distinguish real from dummy. To breach safely, they must clear all marked positions in their lane.</w:t>
@@ -846,7 +846,7 @@
         <w:rPr>
           <w:b/>
         </w:rPr>
-        <w:t xml:space="preserve">Map-based clearance (proposed regime): </w:t>
+        <w:t xml:space="preserve">Map-based clearance (MINE regime): </w:t>
       </w:r>
       <w:r>
         <w:t>Clear all M = N(1+r) positions. Time = M × t_c / k hours. Residual mines after completion = 0 (deterministic guarantee).</w:t>
@@ -2054,7 +2054,7 @@
           </w:tcPr>
           <w:p>
             <w:r>
-              <w:t>Transparent map (proposed)</w:t>
+              <w:t>MINE framework (proposed)</w:t>
             </w:r>
           </w:p>
         </w:tc>
@@ -2355,7 +2355,7 @@
     </w:p>
     <w:p>
       <w:r>
-        <w:t>where H_b(p) = −p log₂(p) − (1−p) log₂(1−p). Under Regime C (transparent map), uncertainty is confined to which N of M positions are real:</w:t>
+        <w:t>where H_b(p) = −p log₂(p) − (1−p) log₂(1−p). Under Regime C (MINE regime), uncertainty is confined to which N of M positions are real:</w:t>
       </w:r>
     </w:p>
     <w:p>
@@ -2955,7 +2955,7 @@
         <w:rPr>
           <w:i/>
         </w:rPr>
-        <w:t>the MINE Registry</w:t>
+        <w:t>MINE Registry</w:t>
       </w:r>
       <w:r>
         <w:t>—a secure, append-only database maintained by a trusted third party (NATO Communications and Information Agency, ICRC, or a dedicated international body) to which deploying states submit position maps. The MINE Registry must accept map submissions (new minefield declarations) and supplements (additional positions added during conflict) but must not permit deletions or modifications of previously submitted entries. This append-only property preserves the completeness guarantee: if a state registers positions, they cannot later remove entries to conceal violations.</w:t>
@@ -2969,7 +2969,7 @@
         <w:rPr>
           <w:i/>
         </w:rPr>
-        <w:t>the MINE verification protocol</w:t>
+        <w:t>MINE verification protocol</w:t>
       </w:r>
       <w:r>
         <w:t>—procedures for confirming compliance both during and after conflict. During conflict, satellite imagery can verify that marked positions show ground disturbance consistent with emplacement. After conflict, clearance operations record whether each position contained a real mine or was dummy, enabling verification of the declared ratio.</w:t>
@@ -2999,7 +2999,7 @@
     </w:p>
     <w:p>
       <w:r>
-        <w:t>The proposed framework is designed to complement CCW Amended Protocol II. It extends the Protocol’s Article 7 recording requirements by: (a) mandating publication during deployment rather than only post-conflict; and (b) formalising the dummy position concept with a regulated ratio. States remaining within the CCW framework could adopt the MINE Protocol as an additional protocol or as a NATO-internal standard.</w:t>
+        <w:t>The MINE framework is designed to complement CCW Amended Protocol II. It extends the Protocol’s Article 7 recording requirements by: (a) mandating publication during deployment rather than only post-conflict; and (b) formalising the dummy position concept with a regulated ratio. States remaining within the CCW framework could adopt the MINE Protocol as an additional protocol or as a NATO-internal standard.</w:t>
       </w:r>
     </w:p>
     <w:p>

</xml_diff>